<commit_message>
Document --host 0.0.0.0 requirement; fixes mobile "Something went wrong"
The backend run command was missing --host 0.0.0.0, so uvicorn defaulted
to binding 127.0.0.1 (localhost only). It passed every local curl check
and started with no errors, but was completely unreachable from a phone
on the same LAN — the exact cause of the mobile app's generic "Something
went wrong" on register/login (the fetch fails with a network error, not
an HTTP error, so the UI has no specific message to show).

- README.md: run command now includes --host 0.0.0.0, with an explanation
  of why it's required once a phone is involved.
- docs/running-locally.docx: same fix, plus a "Common failure" callout at
  step 1.4 and a troubleshooting callout at step 2.5 listing the ordered
  checks for this exact symptom. Step 1.5's verification now checks the
  LAN IP as well as localhost, since that's what actually proves the phone
  can reach the server.

Co-Authored-By: Claude Sonnet 5 <noreply@anthropic.com>
</commit_message>
<xml_diff>
--- a/docs/running-locally.docx
+++ b/docs/running-locally.docx
@@ -622,7 +622,7 @@
           <w:sz w:val="20"/>
           <w:szCs w:val="20"/>
         </w:rPr>
-        <w:t xml:space="preserve">uvicorn app.main:app --reload --port 8000</w:t>
+        <w:t xml:space="preserve">uvicorn app.main:app --reload --host 0.0.0.0 --port 8000</w:t>
       </w:r>
     </w:p>
     <w:p>
@@ -651,7 +651,7 @@
           <w:sz w:val="20"/>
           <w:szCs w:val="20"/>
         </w:rPr>
-        <w:t xml:space="preserve">INFO:     Uvicorn running on http://127.0.0.1:8000</w:t>
+        <w:t xml:space="preserve">INFO:     Uvicorn running on http://0.0.0.0:8000</w:t>
       </w:r>
       <w:r>
         <w:br/>
@@ -668,6 +668,61 @@
     </w:p>
     <w:p>
       <w:pPr>
+        <w:pBdr>
+          <w:left w:val="single" w:color="D64545" w:sz="18" w:space="8"/>
+        </w:pBdr>
+        <w:shd w:fill="FFF1F0" w:val="clear"/>
+        <w:spacing w:after="160" w:before="120"/>
+        <w:ind w:left="200"/>
+      </w:pPr>
+      <w:r>
+        <w:rPr>
+          <w:b/>
+          <w:bCs/>
+          <w:i/>
+          <w:iCs/>
+        </w:rPr>
+        <w:t xml:space="preserve">Common failure: </w:t>
+      </w:r>
+      <w:r>
+        <w:rPr>
+          <w:rFonts w:ascii="Consolas" w:cs="Consolas" w:eastAsia="Consolas" w:hAnsi="Consolas"/>
+          <w:color w:val="AD1457"/>
+          <w:sz w:val="20"/>
+          <w:szCs w:val="20"/>
+        </w:rPr>
+        <w:t xml:space="preserve">--host 0.0.0.0</w:t>
+      </w:r>
+      <w:r>
+        <w:t xml:space="preserve"> is required, not optional, once a phone needs to reach this server. Without it, uvicorn defaults to binding </w:t>
+      </w:r>
+      <w:r>
+        <w:rPr>
+          <w:rFonts w:ascii="Consolas" w:cs="Consolas" w:eastAsia="Consolas" w:hAnsi="Consolas"/>
+          <w:color w:val="AD1457"/>
+          <w:sz w:val="20"/>
+          <w:szCs w:val="20"/>
+        </w:rPr>
+        <w:t xml:space="preserve">127.0.0.1</w:t>
+      </w:r>
+      <w:r>
+        <w:t xml:space="preserve"> — reachable only from this same machine. The backend will pass every </w:t>
+      </w:r>
+      <w:r>
+        <w:rPr>
+          <w:rFonts w:ascii="Consolas" w:cs="Consolas" w:eastAsia="Consolas" w:hAnsi="Consolas"/>
+          <w:color w:val="AD1457"/>
+          <w:sz w:val="20"/>
+          <w:szCs w:val="20"/>
+        </w:rPr>
+        <w:t xml:space="preserve">curl localhost:8000/...</w:t>
+      </w:r>
+      <w:r>
+        <w:t xml:space="preserve"> check, start with no errors, and still be completely unreachable from your phone, because the phone is a different device on the network. This is the single most common cause of the mobile app showing "Something went wrong" when creating an account or logging in — the request never leaves the phone's network stack; there is no HTTP error to show, just a connection failure. If you've already started the server without this flag, stop it (Ctrl+C) and rerun the command above.</w:t>
+      </w:r>
+    </w:p>
+    <w:p>
+      <w:pPr>
         <w:pStyle w:val="Heading2"/>
         <w:spacing w:after="140" w:before="280"/>
       </w:pPr>
@@ -680,7 +735,7 @@
         <w:spacing w:after="160"/>
       </w:pPr>
       <w:r>
-        <w:t xml:space="preserve">In a separate terminal (or your browser):</w:t>
+        <w:t xml:space="preserve">In a separate terminal (or your browser), check both addresses — not just localhost:</w:t>
       </w:r>
     </w:p>
     <w:p>
@@ -703,13 +758,25 @@
         </w:rPr>
         <w:t xml:space="preserve">curl http://localhost:8000/health</w:t>
       </w:r>
+      <w:r>
+        <w:br/>
+        <w:t xml:space="preserve"/>
+      </w:r>
+      <w:r>
+        <w:rPr>
+          <w:rFonts w:ascii="Consolas" w:cs="Consolas" w:eastAsia="Consolas" w:hAnsi="Consolas"/>
+          <w:sz w:val="20"/>
+          <w:szCs w:val="20"/>
+        </w:rPr>
+        <w:t xml:space="preserve">curl http://&lt;your LAN IP from step 0&gt;:8000/health   # this one is what actually proves the phone can reach it</w:t>
+      </w:r>
     </w:p>
     <w:p>
       <w:pPr>
         <w:spacing w:after="160"/>
       </w:pPr>
       <w:r>
-        <w:t xml:space="preserve">Expect: </w:t>
+        <w:t xml:space="preserve">Expect both to return: </w:t>
       </w:r>
       <w:r>
         <w:rPr>
@@ -758,19 +825,19 @@
         <w:t xml:space="preserve">Note: </w:t>
       </w:r>
       <w:r>
-        <w:t xml:space="preserve">If port 8000 is already used by something else on your machine, start on another port instead — </w:t>
-      </w:r>
-      <w:r>
-        <w:rPr>
-          <w:rFonts w:ascii="Consolas" w:cs="Consolas" w:eastAsia="Consolas" w:hAnsi="Consolas"/>
-          <w:color w:val="AD1457"/>
-          <w:sz w:val="20"/>
-          <w:szCs w:val="20"/>
-        </w:rPr>
-        <w:t xml:space="preserve">uvicorn app.main:app --reload --port 8001</w:t>
-      </w:r>
-      <w:r>
-        <w:t xml:space="preserve"> — and use that port number everywhere below.</w:t>
+        <w:t xml:space="preserve">If port 8000 is already used by something else on your machine, start on another port instead — add </w:t>
+      </w:r>
+      <w:r>
+        <w:rPr>
+          <w:rFonts w:ascii="Consolas" w:cs="Consolas" w:eastAsia="Consolas" w:hAnsi="Consolas"/>
+          <w:color w:val="AD1457"/>
+          <w:sz w:val="20"/>
+          <w:szCs w:val="20"/>
+        </w:rPr>
+        <w:t xml:space="preserve">--port 8001</w:t>
+      </w:r>
+      <w:r>
+        <w:t xml:space="preserve"> to the command in 1.4 — and use that port number everywhere below, including in the LAN-IP check above.</w:t>
       </w:r>
     </w:p>
     <w:p>
@@ -955,6 +1022,52 @@
       </w:r>
       <w:r>
         <w:t xml:space="preserve"> — the phone is a separate device on the network and can't resolve those to your dev machine.</w:t>
+      </w:r>
+    </w:p>
+    <w:p>
+      <w:pPr>
+        <w:pBdr>
+          <w:left w:val="single" w:color="1F6FEB" w:sz="18" w:space="8"/>
+        </w:pBdr>
+        <w:shd w:fill="EFF6FF" w:val="clear"/>
+        <w:spacing w:after="160" w:before="120"/>
+        <w:ind w:left="200"/>
+      </w:pPr>
+      <w:r>
+        <w:rPr>
+          <w:b/>
+          <w:bCs/>
+          <w:i/>
+          <w:iCs/>
+        </w:rPr>
+        <w:t xml:space="preserve">Note: </w:t>
+      </w:r>
+      <w:r>
+        <w:t xml:space="preserve">This value alone is not enough if the backend itself is only listening on </w:t>
+      </w:r>
+      <w:r>
+        <w:rPr>
+          <w:rFonts w:ascii="Consolas" w:cs="Consolas" w:eastAsia="Consolas" w:hAnsi="Consolas"/>
+          <w:color w:val="AD1457"/>
+          <w:sz w:val="20"/>
+          <w:szCs w:val="20"/>
+        </w:rPr>
+        <w:t xml:space="preserve">127.0.0.1</w:t>
+      </w:r>
+      <w:r>
+        <w:t xml:space="preserve"> — see the "Common failure" callout in step 1.4. Confirm with the LAN-IP </w:t>
+      </w:r>
+      <w:r>
+        <w:rPr>
+          <w:rFonts w:ascii="Consolas" w:cs="Consolas" w:eastAsia="Consolas" w:hAnsi="Consolas"/>
+          <w:color w:val="AD1457"/>
+          <w:sz w:val="20"/>
+          <w:szCs w:val="20"/>
+        </w:rPr>
+        <w:t xml:space="preserve">curl</w:t>
+      </w:r>
+      <w:r>
+        <w:t xml:space="preserve"> check in step 1.5 before assuming the app's config is wrong.</w:t>
       </w:r>
     </w:p>
     <w:p>
@@ -1177,9 +1290,9 @@
     <w:p>
       <w:pPr>
         <w:pBdr>
-          <w:left w:val="single" w:color="1F6FEB" w:sz="18" w:space="8"/>
-        </w:pBdr>
-        <w:shd w:fill="EFF6FF" w:val="clear"/>
+          <w:left w:val="single" w:color="D64545" w:sz="18" w:space="8"/>
+        </w:pBdr>
+        <w:shd w:fill="FFF1F0" w:val="clear"/>
         <w:spacing w:after="160" w:before="120"/>
         <w:ind w:left="200"/>
       </w:pPr>
@@ -1190,10 +1303,22 @@
           <w:i/>
           <w:iCs/>
         </w:rPr>
-        <w:t xml:space="preserve">Note: </w:t>
-      </w:r>
-      <w:r>
-        <w:t xml:space="preserve">If "Could not start ride" appears, double check step 2.2 — it's almost always the wrong </w:t>
+        <w:t xml:space="preserve">Common failure: </w:t>
+      </w:r>
+      <w:r>
+        <w:t xml:space="preserve">"Something went wrong" on Create account / Log in means the app's fetch call never got a response at all (a real HTTP error, like a wrong password, shows a specific message instead). Check, in order: (1) the backend is running with </w:t>
+      </w:r>
+      <w:r>
+        <w:rPr>
+          <w:rFonts w:ascii="Consolas" w:cs="Consolas" w:eastAsia="Consolas" w:hAnsi="Consolas"/>
+          <w:color w:val="AD1457"/>
+          <w:sz w:val="20"/>
+          <w:szCs w:val="20"/>
+        </w:rPr>
+        <w:t xml:space="preserve">--host 0.0.0.0</w:t>
+      </w:r>
+      <w:r>
+        <w:t xml:space="preserve"> per step 1.4 — this is the most common cause; (2) </w:t>
       </w:r>
       <w:r>
         <w:rPr>
@@ -1205,7 +1330,31 @@
         <w:t xml:space="preserve">API_BASE_URL</w:t>
       </w:r>
       <w:r>
-        <w:t xml:space="preserve">, or the phone and dev machine being on different networks (e.g. phone on cellular data, or a guest Wi-Fi network that isolates devices from each other).</w:t>
+        <w:t xml:space="preserve"> in </w:t>
+      </w:r>
+      <w:r>
+        <w:rPr>
+          <w:rFonts w:ascii="Consolas" w:cs="Consolas" w:eastAsia="Consolas" w:hAnsi="Consolas"/>
+          <w:color w:val="AD1457"/>
+          <w:sz w:val="20"/>
+          <w:szCs w:val="20"/>
+        </w:rPr>
+        <w:t xml:space="preserve">src/api/config.ts</w:t>
+      </w:r>
+      <w:r>
+        <w:t xml:space="preserve"> is your LAN IP, not </w:t>
+      </w:r>
+      <w:r>
+        <w:rPr>
+          <w:rFonts w:ascii="Consolas" w:cs="Consolas" w:eastAsia="Consolas" w:hAnsi="Consolas"/>
+          <w:color w:val="AD1457"/>
+          <w:sz w:val="20"/>
+          <w:szCs w:val="20"/>
+        </w:rPr>
+        <w:t xml:space="preserve">localhost</w:t>
+      </w:r>
+      <w:r>
+        <w:t xml:space="preserve">; (3) the phone and dev machine are on the same Wi-Fi network, not a guest network that isolates devices, and the phone isn't on cellular data; (4) a firewall on your dev machine isn't blocking the port.</w:t>
       </w:r>
     </w:p>
     <w:p>
@@ -1698,7 +1847,7 @@
           <w:sz w:val="20"/>
           <w:szCs w:val="20"/>
         </w:rPr>
-        <w:t xml:space="preserve">cd backend &amp;&amp; source .venv/bin/activate &amp;&amp; uvicorn app.main:app --reload --port 8000</w:t>
+        <w:t xml:space="preserve">cd backend &amp;&amp; source .venv/bin/activate &amp;&amp; uvicorn app.main:app --reload --host 0.0.0.0 --port 8000</w:t>
       </w:r>
       <w:r>
         <w:br/>
@@ -1820,7 +1969,7 @@
       <w:pPr>
         <w:spacing w:after="160"/>
       </w:pPr>
-      <w:hyperlink w:history="1" r:id="rIdetrg75ngevnmgf4tc_ui9">
+      <w:hyperlink w:history="1" r:id="rId3zmhj_fdg68ny5hvewfc8">
         <w:r>
           <w:rPr>
             <w:rStyle w:val="Hyperlink"/>

</xml_diff>